<commit_message>
Fix report matriculation number and clean build output
</commit_message>
<xml_diff>
--- a/Jousaali_infosusteemi_treeningute_funktsionaalne_allsusteem.docx
+++ b/Jousaali_infosusteemi_treeningute_funktsionaalne_allsusteem.docx
@@ -288,7 +288,7 @@
           <w:sz w:val="28"/>
           <w:sz-cs w:val="28"/>
         </w:rPr>
-        <w:t xml:space="preserve">Matrikli nr: Tristan Aik Sild: ; Gustav Tamkivi: 253787IAIB</w:t>
+        <w:t xml:space="preserve">Matrikli nr: Tristan Aik Sild: 253782IAIB; Gustav Tamkivi: 253787IAIB</w:t>
       </w:r>
     </w:p>
     <w:p>
@@ -11814,7 +11814,7 @@
           <w:sz w:val="24"/>
           <w:sz-cs w:val="24"/>
         </w:rPr>
-        <w:t xml:space="preserve">Vastuvõtuaegade haldamise süsteemi tõrgeteta töö on hädavajalik organisatsiooni tõrgeteta töötamiseks. Tõrked tekitaksid suurt praktilist kahju ja ka moraalset kahju. </w:t>
+        <w:t xml:space="preserve">Jõusaali infosüsteemi treeningute funktsionaalse allsüsteemi tõrgeteta töö on hädavajalik organisatsiooni tõrgeteta töötamiseks. Tõrked tekitaksid suurt praktilist kahju ja ka moraalset kahju. </w:t>
       </w:r>
       <w:r>
         <w:rPr>
@@ -29353,7 +29353,7 @@
           <w:sz-cs w:val="24"/>
           <w:b/>
         </w:rPr>
-        <w:t xml:space="preserve">Eeltingimused</w:t>
+        <w:t xml:space="preserve"/>
       </w:r>
       <w:r>
         <w:rPr>
@@ -29361,7 +29361,7 @@
           <w:sz w:val="24"/>
           <w:sz-cs w:val="24"/>
         </w:rPr>
-        <w:t xml:space="preserve">:</w:t>
+        <w:t xml:space="preserve"/>
       </w:r>
     </w:p>
     <w:p>
@@ -29374,7 +29374,7 @@
           <w:sz w:val="24"/>
           <w:sz-cs w:val="24"/>
         </w:rPr>
-        <w:t xml:space="preserve">Töötaja eksemplar t (millel on e_meil=p_e_meil) on registreeritud</w:t>
+        <w:t xml:space="preserve"/>
       </w:r>
     </w:p>
     <w:p>
@@ -29675,7 +29675,7 @@
           <w:sz-cs w:val="24"/>
           <w:b/>
         </w:rPr>
-        <w:t xml:space="preserve">Kasutus kasutusjuhtude poolt: Muuda treeningut</w:t>
+        <w:t xml:space="preserve">Kasutus kasutusjuhtude poolt: Registreeri treening, Muuda treeningut</w:t>
       </w:r>
       <w:r>
         <w:rPr>
@@ -31898,6 +31898,741 @@
           <w:sz-cs w:val="24"/>
         </w:rPr>
         <w:t xml:space="preserve"/>
+      </w:r>
+    </w:p>
+    <w:p>
+      <w:r>
+        <w:t xml:space="preserve">Treeningute registrite tabelite loomise laused</w:t>
+      </w:r>
+    </w:p>
+    <w:p>
+      <w:r>
+        <w:t xml:space="preserve">-- 1. riik</w:t>
+      </w:r>
+    </w:p>
+    <w:p>
+      <w:r>
+        <w:t xml:space="preserve">CREATE TABLE riik (</w:t>
+      </w:r>
+    </w:p>
+    <w:p>
+      <w:r>
+        <w:t xml:space="preserve">    riigi_kood VARCHAR(10) NOT NULL,</w:t>
+      </w:r>
+    </w:p>
+    <w:p>
+      <w:r>
+        <w:t xml:space="preserve">    nimetus VARCHAR(200) NOT NULL CHECK (nimetus &lt;&gt; ''),</w:t>
+      </w:r>
+    </w:p>
+    <w:p>
+      <w:r>
+        <w:t xml:space="preserve">    on_aktiivne BOOLEAN NOT NULL DEFAULT TRUE,</w:t>
+      </w:r>
+    </w:p>
+    <w:p>
+      <w:r>
+        <w:t xml:space="preserve">    CONSTRAINT pk_riik PRIMARY KEY (riigi_kood)</w:t>
+      </w:r>
+    </w:p>
+    <w:p>
+      <w:r>
+        <w:t xml:space="preserve">);</w:t>
+      </w:r>
+    </w:p>
+    <w:p>
+      <w:r>
+        <w:t xml:space="preserve"/>
+      </w:r>
+    </w:p>
+    <w:p>
+      <w:r>
+        <w:t xml:space="preserve">-- 2. isiku_seisundi_liik</w:t>
+      </w:r>
+    </w:p>
+    <w:p>
+      <w:r>
+        <w:t xml:space="preserve">CREATE TABLE isiku_seisundi_liik (</w:t>
+      </w:r>
+    </w:p>
+    <w:p>
+      <w:r>
+        <w:t xml:space="preserve">    kood VARCHAR(10) NOT NULL,</w:t>
+      </w:r>
+    </w:p>
+    <w:p>
+      <w:r>
+        <w:t xml:space="preserve">    nimetus VARCHAR(200) NOT NULL CHECK (nimetus &lt;&gt; ''),</w:t>
+      </w:r>
+    </w:p>
+    <w:p>
+      <w:r>
+        <w:t xml:space="preserve">    on_aktiivne BOOLEAN NOT NULL DEFAULT TRUE,</w:t>
+      </w:r>
+    </w:p>
+    <w:p>
+      <w:r>
+        <w:t xml:space="preserve">    CONSTRAINT pk_isiku_seisundi_liik PRIMARY KEY (kood)</w:t>
+      </w:r>
+    </w:p>
+    <w:p>
+      <w:r>
+        <w:t xml:space="preserve">);</w:t>
+      </w:r>
+    </w:p>
+    <w:p>
+      <w:r>
+        <w:t xml:space="preserve"/>
+      </w:r>
+    </w:p>
+    <w:p>
+      <w:r>
+        <w:t xml:space="preserve">-- 3. tootaja_seisundi_liik</w:t>
+      </w:r>
+    </w:p>
+    <w:p>
+      <w:r>
+        <w:t xml:space="preserve">CREATE TABLE tootaja_seisundi_liik (</w:t>
+      </w:r>
+    </w:p>
+    <w:p>
+      <w:r>
+        <w:t xml:space="preserve">    kood VARCHAR(10) NOT NULL,</w:t>
+      </w:r>
+    </w:p>
+    <w:p>
+      <w:r>
+        <w:t xml:space="preserve">    nimetus VARCHAR(200) NOT NULL CHECK (nimetus &lt;&gt; ''),</w:t>
+      </w:r>
+    </w:p>
+    <w:p>
+      <w:r>
+        <w:t xml:space="preserve">    on_aktiivne BOOLEAN NOT NULL DEFAULT TRUE,</w:t>
+      </w:r>
+    </w:p>
+    <w:p>
+      <w:r>
+        <w:t xml:space="preserve">    CONSTRAINT pk_tootaja_seisundi_liik PRIMARY KEY (kood)</w:t>
+      </w:r>
+    </w:p>
+    <w:p>
+      <w:r>
+        <w:t xml:space="preserve">);</w:t>
+      </w:r>
+    </w:p>
+    <w:p>
+      <w:r>
+        <w:t xml:space="preserve"/>
+      </w:r>
+    </w:p>
+    <w:p>
+      <w:r>
+        <w:t xml:space="preserve">-- 4. tootaja_roll</w:t>
+      </w:r>
+    </w:p>
+    <w:p>
+      <w:r>
+        <w:t xml:space="preserve">CREATE TABLE tootaja_roll (</w:t>
+      </w:r>
+    </w:p>
+    <w:p>
+      <w:r>
+        <w:t xml:space="preserve">    kood VARCHAR(10) NOT NULL,</w:t>
+      </w:r>
+    </w:p>
+    <w:p>
+      <w:r>
+        <w:t xml:space="preserve">    nimetus VARCHAR(200) NOT NULL CHECK (nimetus &lt;&gt; ''),</w:t>
+      </w:r>
+    </w:p>
+    <w:p>
+      <w:r>
+        <w:t xml:space="preserve">    on_aktiivne BOOLEAN NOT NULL DEFAULT TRUE,</w:t>
+      </w:r>
+    </w:p>
+    <w:p>
+      <w:r>
+        <w:t xml:space="preserve">    kirjeldus TEXT,</w:t>
+      </w:r>
+    </w:p>
+    <w:p>
+      <w:r>
+        <w:t xml:space="preserve">    CONSTRAINT pk_tootaja_roll PRIMARY KEY (kood)</w:t>
+      </w:r>
+    </w:p>
+    <w:p>
+      <w:r>
+        <w:t xml:space="preserve">);</w:t>
+      </w:r>
+    </w:p>
+    <w:p>
+      <w:r>
+        <w:t xml:space="preserve"/>
+      </w:r>
+    </w:p>
+    <w:p>
+      <w:r>
+        <w:t xml:space="preserve">-- 5. treeningu_seisundi_liik</w:t>
+      </w:r>
+    </w:p>
+    <w:p>
+      <w:r>
+        <w:t xml:space="preserve">CREATE TABLE treeningu_seisundi_liik (</w:t>
+      </w:r>
+    </w:p>
+    <w:p>
+      <w:r>
+        <w:t xml:space="preserve">    kood VARCHAR(10) NOT NULL,</w:t>
+      </w:r>
+    </w:p>
+    <w:p>
+      <w:r>
+        <w:t xml:space="preserve">    nimetus VARCHAR(200) NOT NULL CHECK (nimetus &lt;&gt; ''),</w:t>
+      </w:r>
+    </w:p>
+    <w:p>
+      <w:r>
+        <w:t xml:space="preserve">    on_aktiivne BOOLEAN NOT NULL DEFAULT TRUE,</w:t>
+      </w:r>
+    </w:p>
+    <w:p>
+      <w:r>
+        <w:t xml:space="preserve">    CONSTRAINT pk_treeningu_seisundi_liik PRIMARY KEY (kood)</w:t>
+      </w:r>
+    </w:p>
+    <w:p>
+      <w:r>
+        <w:t xml:space="preserve">);</w:t>
+      </w:r>
+    </w:p>
+    <w:p>
+      <w:r>
+        <w:t xml:space="preserve"/>
+      </w:r>
+    </w:p>
+    <w:p>
+      <w:r>
+        <w:t xml:space="preserve">-- 6. treeningu_kategooria_tyyp</w:t>
+      </w:r>
+    </w:p>
+    <w:p>
+      <w:r>
+        <w:t xml:space="preserve">CREATE TABLE treeningu_kategooria_tyyp (</w:t>
+      </w:r>
+    </w:p>
+    <w:p>
+      <w:r>
+        <w:t xml:space="preserve">    kood VARCHAR(10) NOT NULL,</w:t>
+      </w:r>
+    </w:p>
+    <w:p>
+      <w:r>
+        <w:t xml:space="preserve">    nimetus VARCHAR(200) NOT NULL CHECK (nimetus &lt;&gt; ''),</w:t>
+      </w:r>
+    </w:p>
+    <w:p>
+      <w:r>
+        <w:t xml:space="preserve">    on_aktiivne BOOLEAN NOT NULL DEFAULT TRUE,</w:t>
+      </w:r>
+    </w:p>
+    <w:p>
+      <w:r>
+        <w:t xml:space="preserve">    CONSTRAINT pk_treeningu_kategooria_tyyp PRIMARY KEY (kood)</w:t>
+      </w:r>
+    </w:p>
+    <w:p>
+      <w:r>
+        <w:t xml:space="preserve">);</w:t>
+      </w:r>
+    </w:p>
+    <w:p>
+      <w:r>
+        <w:t xml:space="preserve"/>
+      </w:r>
+    </w:p>
+    <w:p>
+      <w:r>
+        <w:t xml:space="preserve">-- 7. treeningu_kategooria</w:t>
+      </w:r>
+    </w:p>
+    <w:p>
+      <w:r>
+        <w:t xml:space="preserve">CREATE TABLE treeningu_kategooria (</w:t>
+      </w:r>
+    </w:p>
+    <w:p>
+      <w:r>
+        <w:t xml:space="preserve">    kood VARCHAR(10) NOT NULL,</w:t>
+      </w:r>
+    </w:p>
+    <w:p>
+      <w:r>
+        <w:t xml:space="preserve">    treeningu_kategooria_tyyp_kood VARCHAR(10) NOT NULL,</w:t>
+      </w:r>
+    </w:p>
+    <w:p>
+      <w:r>
+        <w:t xml:space="preserve">    nimetus VARCHAR(200) NOT NULL CHECK (nimetus &lt;&gt; ''),</w:t>
+      </w:r>
+    </w:p>
+    <w:p>
+      <w:r>
+        <w:t xml:space="preserve">    on_aktiivne BOOLEAN NOT NULL DEFAULT TRUE,</w:t>
+      </w:r>
+    </w:p>
+    <w:p>
+      <w:r>
+        <w:t xml:space="preserve">    CONSTRAINT pk_treeningu_kategooria PRIMARY KEY (kood),</w:t>
+      </w:r>
+    </w:p>
+    <w:p>
+      <w:r>
+        <w:t xml:space="preserve">    CONSTRAINT fk_treeningu_kategooria_tyyp FOREIGN KEY (treeningu_kategooria_tyyp_kood)</w:t>
+      </w:r>
+    </w:p>
+    <w:p>
+      <w:r>
+        <w:t xml:space="preserve">        REFERENCES treeningu_kategooria_tyyp (kood)</w:t>
+      </w:r>
+    </w:p>
+    <w:p>
+      <w:r>
+        <w:t xml:space="preserve">);</w:t>
+      </w:r>
+    </w:p>
+    <w:p>
+      <w:r>
+        <w:t xml:space="preserve"/>
+      </w:r>
+    </w:p>
+    <w:p>
+      <w:r>
+        <w:t xml:space="preserve">-- 8. isik</w:t>
+      </w:r>
+    </w:p>
+    <w:p>
+      <w:r>
+        <w:t xml:space="preserve">CREATE TABLE isik (</w:t>
+      </w:r>
+    </w:p>
+    <w:p>
+      <w:r>
+        <w:t xml:space="preserve">    isikukood VARCHAR(20) NOT NULL,</w:t>
+      </w:r>
+    </w:p>
+    <w:p>
+      <w:r>
+        <w:t xml:space="preserve">    riigi_kood VARCHAR(10) NOT NULL,</w:t>
+      </w:r>
+    </w:p>
+    <w:p>
+      <w:r>
+        <w:t xml:space="preserve">    isiku_seisundi_liik_kood VARCHAR(10) NOT NULL,</w:t>
+      </w:r>
+    </w:p>
+    <w:p>
+      <w:r>
+        <w:t xml:space="preserve">    synni_kp DATE,</w:t>
+      </w:r>
+    </w:p>
+    <w:p>
+      <w:r>
+        <w:t xml:space="preserve">    reg_aeg TIMESTAMP NOT NULL,</w:t>
+      </w:r>
+    </w:p>
+    <w:p>
+      <w:r>
+        <w:t xml:space="preserve">    viimase_muutm_aeg TIMESTAMP NOT NULL,</w:t>
+      </w:r>
+    </w:p>
+    <w:p>
+      <w:r>
+        <w:t xml:space="preserve">    eesnimi VARCHAR(200),</w:t>
+      </w:r>
+    </w:p>
+    <w:p>
+      <w:r>
+        <w:t xml:space="preserve">    perenimi VARCHAR(200),</w:t>
+      </w:r>
+    </w:p>
+    <w:p>
+      <w:r>
+        <w:t xml:space="preserve">    elukoht VARCHAR(500),</w:t>
+      </w:r>
+    </w:p>
+    <w:p>
+      <w:r>
+        <w:t xml:space="preserve">    e_meil VARCHAR(254),</w:t>
+      </w:r>
+    </w:p>
+    <w:p>
+      <w:r>
+        <w:t xml:space="preserve">    CONSTRAINT pk_isik PRIMARY KEY (isikukood, riigi_kood),</w:t>
+      </w:r>
+    </w:p>
+    <w:p>
+      <w:r>
+        <w:t xml:space="preserve">    CONSTRAINT fk_isik_riik FOREIGN KEY (riigi_kood)</w:t>
+      </w:r>
+    </w:p>
+    <w:p>
+      <w:r>
+        <w:t xml:space="preserve">        REFERENCES riik (riigi_kood),</w:t>
+      </w:r>
+    </w:p>
+    <w:p>
+      <w:r>
+        <w:t xml:space="preserve">    CONSTRAINT fk_isik_seisund FOREIGN KEY (isiku_seisundi_liik_kood)</w:t>
+      </w:r>
+    </w:p>
+    <w:p>
+      <w:r>
+        <w:t xml:space="preserve">        REFERENCES isiku_seisundi_liik (kood)</w:t>
+      </w:r>
+    </w:p>
+    <w:p>
+      <w:r>
+        <w:t xml:space="preserve">);</w:t>
+      </w:r>
+    </w:p>
+    <w:p>
+      <w:r>
+        <w:t xml:space="preserve"/>
+      </w:r>
+    </w:p>
+    <w:p>
+      <w:r>
+        <w:t xml:space="preserve">-- 9. kasutajakonto</w:t>
+      </w:r>
+    </w:p>
+    <w:p>
+      <w:r>
+        <w:t xml:space="preserve">CREATE TABLE kasutajakonto (</w:t>
+      </w:r>
+    </w:p>
+    <w:p>
+      <w:r>
+        <w:t xml:space="preserve">    e_meil VARCHAR(254) NOT NULL,</w:t>
+      </w:r>
+    </w:p>
+    <w:p>
+      <w:r>
+        <w:t xml:space="preserve">    parool VARCHAR(255) NOT NULL,</w:t>
+      </w:r>
+    </w:p>
+    <w:p>
+      <w:r>
+        <w:t xml:space="preserve">    on_aktiivne BOOLEAN NOT NULL DEFAULT TRUE,</w:t>
+      </w:r>
+    </w:p>
+    <w:p>
+      <w:r>
+        <w:t xml:space="preserve">    CONSTRAINT pk_kasutajakonto PRIMARY KEY (e_meil),</w:t>
+      </w:r>
+    </w:p>
+    <w:p>
+      <w:r>
+        <w:t xml:space="preserve">    CONSTRAINT fk_kasutajakonto_isik FOREIGN KEY (e_meil)</w:t>
+      </w:r>
+    </w:p>
+    <w:p>
+      <w:r>
+        <w:t xml:space="preserve">        REFERENCES isik (e_meil)</w:t>
+      </w:r>
+    </w:p>
+    <w:p>
+      <w:r>
+        <w:t xml:space="preserve">);</w:t>
+      </w:r>
+    </w:p>
+    <w:p>
+      <w:r>
+        <w:t xml:space="preserve"/>
+      </w:r>
+    </w:p>
+    <w:p>
+      <w:r>
+        <w:t xml:space="preserve">-- 10. tootaja</w:t>
+      </w:r>
+    </w:p>
+    <w:p>
+      <w:r>
+        <w:t xml:space="preserve">CREATE TABLE tootaja (</w:t>
+      </w:r>
+    </w:p>
+    <w:p>
+      <w:r>
+        <w:t xml:space="preserve">    e_meil VARCHAR(254) NOT NULL,</w:t>
+      </w:r>
+    </w:p>
+    <w:p>
+      <w:r>
+        <w:t xml:space="preserve">    tootaja_seisundi_liik_kood VARCHAR(10) NOT NULL,</w:t>
+      </w:r>
+    </w:p>
+    <w:p>
+      <w:r>
+        <w:t xml:space="preserve">    CONSTRAINT pk_tootaja PRIMARY KEY (e_meil),</w:t>
+      </w:r>
+    </w:p>
+    <w:p>
+      <w:r>
+        <w:t xml:space="preserve">    CONSTRAINT fk_tootaja_konto FOREIGN KEY (e_meil)</w:t>
+      </w:r>
+    </w:p>
+    <w:p>
+      <w:r>
+        <w:t xml:space="preserve">        REFERENCES kasutajakonto (e_meil),</w:t>
+      </w:r>
+    </w:p>
+    <w:p>
+      <w:r>
+        <w:t xml:space="preserve">    CONSTRAINT fk_tootaja_seisund FOREIGN KEY (tootaja_seisundi_liik_kood)</w:t>
+      </w:r>
+    </w:p>
+    <w:p>
+      <w:r>
+        <w:t xml:space="preserve">        REFERENCES tootaja_seisundi_liik (kood)</w:t>
+      </w:r>
+    </w:p>
+    <w:p>
+      <w:r>
+        <w:t xml:space="preserve">);</w:t>
+      </w:r>
+    </w:p>
+    <w:p>
+      <w:r>
+        <w:t xml:space="preserve"/>
+      </w:r>
+    </w:p>
+    <w:p>
+      <w:r>
+        <w:t xml:space="preserve">-- 11. tootaja_rolli_omamine</w:t>
+      </w:r>
+    </w:p>
+    <w:p>
+      <w:r>
+        <w:t xml:space="preserve">CREATE TABLE tootaja_rolli_omamine (</w:t>
+      </w:r>
+    </w:p>
+    <w:p>
+      <w:r>
+        <w:t xml:space="preserve">    tootaja_e_meil VARCHAR(254) NOT NULL,</w:t>
+      </w:r>
+    </w:p>
+    <w:p>
+      <w:r>
+        <w:t xml:space="preserve">    tootaja_roll_kood VARCHAR(10) NOT NULL,</w:t>
+      </w:r>
+    </w:p>
+    <w:p>
+      <w:r>
+        <w:t xml:space="preserve">    alguse_aeg TIMESTAMP NOT NULL,</w:t>
+      </w:r>
+    </w:p>
+    <w:p>
+      <w:r>
+        <w:t xml:space="preserve">    lopu_aeg TIMESTAMP NOT NULL,</w:t>
+      </w:r>
+    </w:p>
+    <w:p>
+      <w:r>
+        <w:t xml:space="preserve">    CONSTRAINT pk_tootaja_rolli_omamine PRIMARY KEY (tootaja_e_meil, tootaja_roll_kood, alguse_aeg),</w:t>
+      </w:r>
+    </w:p>
+    <w:p>
+      <w:r>
+        <w:t xml:space="preserve">    CONSTRAINT fk_rolli_omamine_tootaja FOREIGN KEY (tootaja_e_meil)</w:t>
+      </w:r>
+    </w:p>
+    <w:p>
+      <w:r>
+        <w:t xml:space="preserve">        REFERENCES tootaja (e_meil),</w:t>
+      </w:r>
+    </w:p>
+    <w:p>
+      <w:r>
+        <w:t xml:space="preserve">    CONSTRAINT fk_rolli_omamine_roll FOREIGN KEY (tootaja_roll_kood)</w:t>
+      </w:r>
+    </w:p>
+    <w:p>
+      <w:r>
+        <w:t xml:space="preserve">        REFERENCES tootaja_roll (kood)</w:t>
+      </w:r>
+    </w:p>
+    <w:p>
+      <w:r>
+        <w:t xml:space="preserve">);</w:t>
+      </w:r>
+    </w:p>
+    <w:p>
+      <w:r>
+        <w:t xml:space="preserve"/>
+      </w:r>
+    </w:p>
+    <w:p>
+      <w:r>
+        <w:t xml:space="preserve">-- 12. treening</w:t>
+      </w:r>
+    </w:p>
+    <w:p>
+      <w:r>
+        <w:t xml:space="preserve">CREATE TABLE treening (</w:t>
+      </w:r>
+    </w:p>
+    <w:p>
+      <w:r>
+        <w:t xml:space="preserve">    treeningu_kood INTEGER NOT NULL CHECK (treeningu_kood &gt; 0),</w:t>
+      </w:r>
+    </w:p>
+    <w:p>
+      <w:r>
+        <w:t xml:space="preserve">    treeningu_seisundi_liik_kood VARCHAR(10) NOT NULL,</w:t>
+      </w:r>
+    </w:p>
+    <w:p>
+      <w:r>
+        <w:t xml:space="preserve">    registreerija_e_meil VARCHAR(254) NOT NULL,</w:t>
+      </w:r>
+    </w:p>
+    <w:p>
+      <w:r>
+        <w:t xml:space="preserve">    viimase_muutja_e_meil VARCHAR(254) NOT NULL,</w:t>
+      </w:r>
+    </w:p>
+    <w:p>
+      <w:r>
+        <w:t xml:space="preserve">    reg_aeg TIMESTAMP NOT NULL,</w:t>
+      </w:r>
+    </w:p>
+    <w:p>
+      <w:r>
+        <w:t xml:space="preserve">    viimase_muutm_aeg TIMESTAMP NOT NULL,</w:t>
+      </w:r>
+    </w:p>
+    <w:p>
+      <w:r>
+        <w:t xml:space="preserve">    nimetus VARCHAR(200) NOT NULL CHECK (nimetus &lt;&gt; ''),</w:t>
+      </w:r>
+    </w:p>
+    <w:p>
+      <w:r>
+        <w:t xml:space="preserve">    kirjeldus TEXT,</w:t>
+      </w:r>
+    </w:p>
+    <w:p>
+      <w:r>
+        <w:t xml:space="preserve">    kestus_minutites INTEGER CHECK (kestus_minutites &gt; 0),</w:t>
+      </w:r>
+    </w:p>
+    <w:p>
+      <w:r>
+        <w:t xml:space="preserve">    maksimaalne_osalejate_arv INTEGER,</w:t>
+      </w:r>
+    </w:p>
+    <w:p>
+      <w:r>
+        <w:t xml:space="preserve">    vajalik_varustus TEXT,</w:t>
+      </w:r>
+    </w:p>
+    <w:p>
+      <w:r>
+        <w:t xml:space="preserve">    hind NUMERIC(8,2) CHECK (hind &gt;= 0),</w:t>
+      </w:r>
+    </w:p>
+    <w:p>
+      <w:r>
+        <w:t xml:space="preserve">    CONSTRAINT pk_treening PRIMARY KEY (treeningu_kood),</w:t>
+      </w:r>
+    </w:p>
+    <w:p>
+      <w:r>
+        <w:t xml:space="preserve">    CONSTRAINT fk_treeningu_seisund FOREIGN KEY (treeningu_seisundi_liik_kood)</w:t>
+      </w:r>
+    </w:p>
+    <w:p>
+      <w:r>
+        <w:t xml:space="preserve">        REFERENCES treeningu_seisundi_liik (kood),</w:t>
+      </w:r>
+    </w:p>
+    <w:p>
+      <w:r>
+        <w:t xml:space="preserve">    CONSTRAINT fk_treeningu_registreerija FOREIGN KEY (registreerija_e_meil)</w:t>
+      </w:r>
+    </w:p>
+    <w:p>
+      <w:r>
+        <w:t xml:space="preserve">        REFERENCES kasutajakonto (e_meil),</w:t>
+      </w:r>
+    </w:p>
+    <w:p>
+      <w:r>
+        <w:t xml:space="preserve">    CONSTRAINT fk_treeningu_muutja FOREIGN KEY (viimase_muutja_e_meil)</w:t>
+      </w:r>
+    </w:p>
+    <w:p>
+      <w:r>
+        <w:t xml:space="preserve">        REFERENCES kasutajakonto (e_meil)</w:t>
+      </w:r>
+    </w:p>
+    <w:p>
+      <w:r>
+        <w:t xml:space="preserve">);</w:t>
+      </w:r>
+    </w:p>
+    <w:p>
+      <w:r>
+        <w:t xml:space="preserve"/>
+      </w:r>
+    </w:p>
+    <w:p>
+      <w:r>
+        <w:t xml:space="preserve">-- 13. treeningu_kategooria_omamine</w:t>
+      </w:r>
+    </w:p>
+    <w:p>
+      <w:r>
+        <w:t xml:space="preserve">CREATE TABLE treeningu_kategooria_omamine (</w:t>
+      </w:r>
+    </w:p>
+    <w:p>
+      <w:r>
+        <w:t xml:space="preserve">    treeningu_kood INTEGER NOT NULL CHECK (treeningu_kood &gt; 0),</w:t>
+      </w:r>
+    </w:p>
+    <w:p>
+      <w:r>
+        <w:t xml:space="preserve">    treeningu_kategooria_kood VARCHAR(10) NOT NULL,</w:t>
+      </w:r>
+    </w:p>
+    <w:p>
+      <w:r>
+        <w:t xml:space="preserve">    CONSTRAINT pk_treeningu_kategooria_omamine PRIMARY KEY (treeningu_kood, treeningu_kategooria_kood),</w:t>
+      </w:r>
+    </w:p>
+    <w:p>
+      <w:r>
+        <w:t xml:space="preserve">    CONSTRAINT fk_kategooria_omamine_treening FOREIGN KEY (treeningu_kood)</w:t>
+      </w:r>
+    </w:p>
+    <w:p>
+      <w:r>
+        <w:t xml:space="preserve">        REFERENCES treening (treeningu_kood),</w:t>
+      </w:r>
+    </w:p>
+    <w:p>
+      <w:r>
+        <w:t xml:space="preserve">    CONSTRAINT fk_kategooria_omamine_kategooria FOREIGN KEY (treeningu_kategooria_kood)</w:t>
+      </w:r>
+    </w:p>
+    <w:p>
+      <w:r>
+        <w:t xml:space="preserve">        REFERENCES treeningu_kategooria (kood)</w:t>
+      </w:r>
+    </w:p>
+    <w:p>
+      <w:r>
+        <w:t xml:space="preserve">);</w:t>
       </w:r>
     </w:p>
     <w:p>

</xml_diff>

<commit_message>
Restore student metadata on report title page
</commit_message>
<xml_diff>
--- a/Jousaali_infosusteemi_treeningute_funktsionaalne_allsusteem.docx
+++ b/Jousaali_infosusteemi_treeningute_funktsionaalne_allsusteem.docx
@@ -41,7 +41,11 @@
       <w:r>
         <w:t>Autorid: Tristan Aik Sild, Gustav Tamkivi</w:t>
         <w:br/>
-        <w:t>E-post: gustavpaul@tamkivi.com</w:t>
+        <w:t>Õpperühm: IAIB23</w:t>
+        <w:br/>
+        <w:t>Matrikli nr: Tristan Aik Sild: 253782IAIB; Gustav Tamkivi: 253787IAIB</w:t>
+        <w:br/>
+        <w:t>e-posti aadressid: Gustav Tamkivi: gustav@taltech.ee; Tristan Aik Sild: trists@taltech.ee</w:t>
         <w:br/>
         <w:t>Tallinn 2026</w:t>
       </w:r>

</xml_diff>

<commit_message>
Restore report front matter and heading numbering
</commit_message>
<xml_diff>
--- a/Jousaali_infosusteemi_treeningute_funktsionaalne_allsusteem.docx
+++ b/Jousaali_infosusteemi_treeningute_funktsionaalne_allsusteem.docx
@@ -2,6 +2,31 @@
 <file path=word/document.xml><?xml version="1.0" encoding="utf-8"?>
 <w:document xmlns:wpc="http://schemas.microsoft.com/office/word/2010/wordprocessingCanvas" xmlns:mo="http://schemas.microsoft.com/office/mac/office/2008/main" xmlns:mc="http://schemas.openxmlformats.org/markup-compatibility/2006" xmlns:mv="urn:schemas-microsoft-com:mac:vml" xmlns:o="urn:schemas-microsoft-com:office:office" xmlns:r="http://schemas.openxmlformats.org/officeDocument/2006/relationships" xmlns:m="http://schemas.openxmlformats.org/officeDocument/2006/math" xmlns:v="urn:schemas-microsoft-com:vml" xmlns:wp14="http://schemas.microsoft.com/office/word/2010/wordprocessingDrawing" xmlns:wp="http://schemas.openxmlformats.org/drawingml/2006/wordprocessingDrawing" xmlns:w10="urn:schemas-microsoft-com:office:word" xmlns:w="http://schemas.openxmlformats.org/wordprocessingml/2006/main" xmlns:w14="http://schemas.microsoft.com/office/word/2010/wordml" xmlns:wpg="http://schemas.microsoft.com/office/word/2010/wordprocessingGroup" xmlns:wpi="http://schemas.microsoft.com/office/word/2010/wordprocessingInk" xmlns:wne="http://schemas.microsoft.com/office/word/2006/wordml" xmlns:wps="http://schemas.microsoft.com/office/word/2010/wordprocessingShape" mc:Ignorable="w14 wp14">
   <w:body>
+    <w:p>
+      <w:pPr>
+        <w:jc w:val="center"/>
+      </w:pPr>
+      <w:r>
+        <w:t>TALLINNA TEHNIKAÜLIKOOL</w:t>
+      </w:r>
+    </w:p>
+    <w:p>
+      <w:pPr>
+        <w:jc w:val="center"/>
+      </w:pPr>
+      <w:r>
+        <w:t>Infotehnoloogia teaduskond</w:t>
+      </w:r>
+    </w:p>
+    <w:p>
+      <w:pPr>
+        <w:jc w:val="center"/>
+      </w:pPr>
+      <w:r>
+        <w:t>Tarkvarateaduse instituut</w:t>
+      </w:r>
+    </w:p>
+    <w:p/>
     <w:p/>
     <w:p/>
     <w:p/>
@@ -21,7 +46,6 @@
         <w:t>treeningute funktsionaalne allsüsteem</w:t>
       </w:r>
     </w:p>
-    <w:p/>
     <w:p>
       <w:pPr>
         <w:jc w:val="center"/>
@@ -30,22 +54,28 @@
         <w:rPr>
           <w:b/>
         </w:rPr>
-        <w:t>Süsteemianalüüsi ja andmebaasi disaini projekt</w:t>
+        <w:t>Andmebaasid I, ITI0206</w:t>
       </w:r>
     </w:p>
+    <w:p/>
+    <w:p/>
+    <w:p/>
+    <w:p/>
     <w:p/>
     <w:p>
       <w:pPr>
         <w:jc w:val="center"/>
       </w:pPr>
       <w:r>
-        <w:t>Autorid: Tristan Aik Sild, Gustav Tamkivi</w:t>
+        <w:t>Üliõpilased: Tristan Aik Sild, Gustav Tamkivi</w:t>
         <w:br/>
         <w:t>Õpperühm: IAIB23</w:t>
         <w:br/>
         <w:t>Matrikli nr: Tristan Aik Sild: 253782IAIB; Gustav Tamkivi: 253787IAIB</w:t>
         <w:br/>
         <w:t>e-posti aadressid: Gustav Tamkivi: gustav@taltech.ee; Tristan Aik Sild: trists@taltech.ee</w:t>
+        <w:br/>
+        <w:t>Juhendaja: Erki Eessaar</w:t>
         <w:br/>
         <w:t>Tallinn 2026</w:t>
       </w:r>
@@ -2318,7 +2348,7 @@
         <w:pStyle w:val="Heading3"/>
       </w:pPr>
       <w:r>
-        <w:t>4.2 Tuvasta kasutaja</w:t>
+        <w:t>4.2.1 Tuvasta kasutaja</w:t>
       </w:r>
     </w:p>
     <w:p>
@@ -2830,7 +2860,7 @@
         <w:pStyle w:val="Heading3"/>
       </w:pPr>
       <w:r>
-        <w:t>4.2 Registreeri treening</w:t>
+        <w:t>4.2.2 Registreeri treening</w:t>
       </w:r>
     </w:p>
     <w:p>
@@ -3432,7 +3462,7 @@
         <w:pStyle w:val="Heading3"/>
       </w:pPr>
       <w:r>
-        <w:t>4.2 Muuda treeningut</w:t>
+        <w:t>4.2.3 Muuda treeningut</w:t>
       </w:r>
     </w:p>
     <w:p>
@@ -4096,7 +4126,7 @@
         <w:pStyle w:val="Heading3"/>
       </w:pPr>
       <w:r>
-        <w:t>4.2 Unusta treening</w:t>
+        <w:t>4.2.4 Unusta treening</w:t>
       </w:r>
     </w:p>
     <w:p>
@@ -4632,7 +4662,7 @@
         <w:pStyle w:val="Heading3"/>
       </w:pPr>
       <w:r>
-        <w:t>4.2 Aktiveeri treening</w:t>
+        <w:t>4.2.5 Aktiveeri treening</w:t>
       </w:r>
     </w:p>
     <w:p>
@@ -5234,7 +5264,7 @@
         <w:pStyle w:val="Heading3"/>
       </w:pPr>
       <w:r>
-        <w:t>4.2 Muuda treening mitteaktiivseks</w:t>
+        <w:t>4.2.6 Muuda treening mitteaktiivseks</w:t>
       </w:r>
     </w:p>
     <w:p>
@@ -5792,7 +5822,7 @@
         <w:pStyle w:val="Heading3"/>
       </w:pPr>
       <w:r>
-        <w:t>4.2 Lõpeta treening</w:t>
+        <w:t>4.2.7 Lõpeta treening</w:t>
       </w:r>
     </w:p>
     <w:p>
@@ -6350,7 +6380,7 @@
         <w:pStyle w:val="Heading3"/>
       </w:pPr>
       <w:r>
-        <w:t>4.2 Vaata aktiivseid treeninguid</w:t>
+        <w:t>4.2.8 Vaata aktiivseid treeninguid</w:t>
       </w:r>
     </w:p>
     <w:p>
@@ -6874,7 +6904,7 @@
         <w:pStyle w:val="Heading3"/>
       </w:pPr>
       <w:r>
-        <w:t>4.2 Vaata treeningute koondaruannet</w:t>
+        <w:t>4.2.9 Vaata treeningute koondaruannet</w:t>
       </w:r>
     </w:p>
     <w:p>
@@ -12678,7 +12708,7 @@
     </w:p>
     <w:p>
       <w:r>
-        <w:t>Projekt on taastoodetav jälgitavatest lähtefailidest. Lõppartefaktid genereeritakse skriptiga, mis loob DOCX dokumendi, teisendab EAP malli ja rakendab EAP parandused.</w:t>
+        <w:t>Projekt on taastoodetav jälgitavatest lähtefailidest. Lõppartefaktid genereeritakse skriptiga, mis loob DOCX dokumendi, teisendab EAP malli, rakendab EAP parandused ning väljastab PostgreSQL DDL skripti.</w:t>
       </w:r>
     </w:p>
     <w:p>
@@ -12858,6 +12888,50 @@
           <w:p>
             <w:r>
               <w:t>PostgreSQL DDL lähtefail.</w:t>
+            </w:r>
+          </w:p>
+        </w:tc>
+      </w:tr>
+      <w:tr>
+        <w:tc>
+          <w:tcPr>
+            <w:tcW w:type="dxa" w:w="4677"/>
+          </w:tcPr>
+          <w:p>
+            <w:r>
+              <w:t>jousaali_skript.sql</w:t>
+            </w:r>
+          </w:p>
+        </w:tc>
+        <w:tc>
+          <w:tcPr>
+            <w:tcW w:type="dxa" w:w="4677"/>
+          </w:tcPr>
+          <w:p>
+            <w:r>
+              <w:t>Esitamiseks mõeldud PostgreSQL tabelite loomise skript.</w:t>
+            </w:r>
+          </w:p>
+        </w:tc>
+      </w:tr>
+      <w:tr>
+        <w:tc>
+          <w:tcPr>
+            <w:tcW w:type="dxa" w:w="4677"/>
+          </w:tcPr>
+          <w:p>
+            <w:r>
+              <w:t>rakendus/</w:t>
+            </w:r>
+          </w:p>
+        </w:tc>
+        <w:tc>
+          <w:tcPr>
+            <w:tcW w:type="dxa" w:w="4677"/>
+          </w:tcPr>
+          <w:p>
+            <w:r>
+              <w:t>Treeneri töökoha prototüübi lähtekood ja käivitamisjuhend.</w:t>
             </w:r>
           </w:p>
         </w:tc>

</xml_diff>